<commit_message>
Correct research paper author details
</commit_message>
<xml_diff>
--- a/docs/IEEE_Research_Paper_Disease_Outbreak_AI.docx
+++ b/docs/IEEE_Research_Paper_Disease_Outbreak_AI.docx
@@ -49,11 +49,11 @@
           <w:color w:val="000000"/>
           <w:sz w:val="20"/>
         </w:rPr>
-        <w:t>Department of Electronics and Telecommunication Engineering</w:t>
+        <w:t>Electronics and telecommunication department</w:t>
         <w:br/>
-        <w:t>Suryodaya College of Engineering and Technology, Nagpur</w:t>
+        <w:t>Suryodaya college of engineering and technology, Nagpur</w:t>
         <w:br/>
-        <w:t>Nagpur, Maharashtra, India</w:t>
+        <w:t>Nagpur, Maharashtra</w:t>
         <w:br/>
         <w:t>harshalwaghe91@gmail.com</w:t>
       </w:r>

</xml_diff>